<commit_message>
Vervang lesplan situatie 2 door Lesplan_Dagopening_CHE_Sohne.pdf
Co-authored-by: Cursor <cursoragent@cursor.com>
</commit_message>
<xml_diff>
--- a/Bestanden/Lesplannen/Lesplan_Dagopening_CHE_Sohne.docx
+++ b/Bestanden/Lesplannen/Lesplan_Dagopening_CHE_Sohne.docx
@@ -43,15 +43,19 @@
               <w:spacing w:after="0" w:line="240" w:lineRule="auto"/>
               <w:rPr>
                 <w:rFonts w:hint="eastAsia"/>
+                <w:b/>
+                <w:bCs/>
               </w:rPr>
             </w:pPr>
             <w:r>
               <w:rPr>
                 <w:rFonts w:ascii="Test Söhne Fett" w:eastAsia="Test Söhne Fett" w:hAnsi="Test Söhne Fett" w:cs="Test Söhne Fett"/>
+                <w:b/>
+                <w:bCs/>
                 <w:color w:val="FFFFFF"/>
                 <w:sz w:val="50"/>
               </w:rPr>
-              <w:t>Lesplan</w:t>
+              <w:t>LESPLAN</w:t>
             </w:r>
           </w:p>
           <w:p>
@@ -59,15 +63,31 @@
               <w:spacing w:after="0" w:line="240" w:lineRule="auto"/>
               <w:rPr>
                 <w:rFonts w:hint="eastAsia"/>
+                <w:b/>
+                <w:bCs/>
               </w:rPr>
             </w:pPr>
+            <w:proofErr w:type="gramStart"/>
             <w:r>
               <w:rPr>
                 <w:rFonts w:ascii="Test Söhne Halbfett" w:eastAsia="Test Söhne Halbfett" w:hAnsi="Test Söhne Halbfett" w:cs="Test Söhne Halbfett"/>
+                <w:b/>
+                <w:bCs/>
                 <w:color w:val="FFFFFF"/>
                 <w:sz w:val="13"/>
               </w:rPr>
-              <w:t>DAGOPENING  /  DEELTIJD THEOLOGIE</w:t>
+              <w:t>DAGOPENING  /</w:t>
+            </w:r>
+            <w:proofErr w:type="gramEnd"/>
+            <w:r>
+              <w:rPr>
+                <w:rFonts w:ascii="Test Söhne Halbfett" w:eastAsia="Test Söhne Halbfett" w:hAnsi="Test Söhne Halbfett" w:cs="Test Söhne Halbfett"/>
+                <w:b/>
+                <w:bCs/>
+                <w:color w:val="FFFFFF"/>
+                <w:sz w:val="13"/>
+              </w:rPr>
+              <w:t xml:space="preserve">  DEELTIJD THEOLOGIE</w:t>
             </w:r>
           </w:p>
         </w:tc>
@@ -89,15 +109,19 @@
               <w:jc w:val="center"/>
               <w:rPr>
                 <w:rFonts w:hint="eastAsia"/>
+                <w:b/>
+                <w:bCs/>
               </w:rPr>
             </w:pPr>
             <w:r>
               <w:rPr>
                 <w:rFonts w:hint="eastAsia"/>
+                <w:b/>
+                <w:bCs/>
                 <w:noProof/>
               </w:rPr>
               <w:drawing>
-                <wp:anchor distT="0" distB="0" distL="114300" distR="114300" simplePos="0" relativeHeight="251658240" behindDoc="0" locked="0" layoutInCell="1" allowOverlap="1" wp14:anchorId="111CCD9D" wp14:editId="7F49E30D">
+                <wp:anchor distT="0" distB="0" distL="114300" distR="114300" simplePos="0" relativeHeight="251660800" behindDoc="0" locked="0" layoutInCell="1" allowOverlap="1" wp14:anchorId="111CCD9D" wp14:editId="7F49E30D">
                   <wp:simplePos x="0" y="0"/>
                   <wp:positionH relativeFrom="column">
                     <wp:posOffset>279400</wp:posOffset>
@@ -155,6 +179,8 @@
         <w:spacing w:after="0" w:line="80" w:lineRule="exact"/>
         <w:rPr>
           <w:rFonts w:hint="eastAsia"/>
+          <w:b/>
+          <w:bCs/>
         </w:rPr>
       </w:pPr>
     </w:p>
@@ -200,11 +226,15 @@
               <w:spacing w:after="20" w:line="240" w:lineRule="auto"/>
               <w:rPr>
                 <w:rFonts w:hint="eastAsia"/>
+                <w:b/>
+                <w:bCs/>
               </w:rPr>
             </w:pPr>
             <w:r>
               <w:rPr>
                 <w:rFonts w:ascii="Test Söhne Halbfett" w:eastAsia="Test Söhne Halbfett" w:hAnsi="Test Söhne Halbfett" w:cs="Test Söhne Halbfett"/>
+                <w:b/>
+                <w:bCs/>
                 <w:color w:val="2C3C64"/>
                 <w:sz w:val="12"/>
               </w:rPr>
@@ -216,11 +246,15 @@
               <w:spacing w:after="0" w:line="240" w:lineRule="auto"/>
               <w:rPr>
                 <w:rFonts w:hint="eastAsia"/>
+                <w:b/>
+                <w:bCs/>
               </w:rPr>
             </w:pPr>
             <w:r>
               <w:rPr>
                 <w:rFonts w:ascii="Test Söhne Fett" w:eastAsia="Test Söhne Fett" w:hAnsi="Test Söhne Fett" w:cs="Test Söhne Fett"/>
+                <w:b/>
+                <w:bCs/>
                 <w:sz w:val="25"/>
               </w:rPr>
               <w:t>7</w:t>
@@ -244,11 +278,15 @@
               <w:spacing w:after="20" w:line="240" w:lineRule="auto"/>
               <w:rPr>
                 <w:rFonts w:hint="eastAsia"/>
+                <w:b/>
+                <w:bCs/>
               </w:rPr>
             </w:pPr>
             <w:r>
               <w:rPr>
                 <w:rFonts w:ascii="Test Söhne Halbfett" w:eastAsia="Test Söhne Halbfett" w:hAnsi="Test Söhne Halbfett" w:cs="Test Söhne Halbfett"/>
+                <w:b/>
+                <w:bCs/>
                 <w:color w:val="2C3C64"/>
                 <w:sz w:val="12"/>
               </w:rPr>
@@ -260,11 +298,15 @@
               <w:spacing w:after="0" w:line="240" w:lineRule="auto"/>
               <w:rPr>
                 <w:rFonts w:hint="eastAsia"/>
+                <w:b/>
+                <w:bCs/>
               </w:rPr>
             </w:pPr>
             <w:r>
               <w:rPr>
                 <w:rFonts w:ascii="Test Söhne Fett" w:eastAsia="Test Söhne Fett" w:hAnsi="Test Söhne Fett" w:cs="Test Söhne Fett"/>
+                <w:b/>
+                <w:bCs/>
                 <w:sz w:val="25"/>
               </w:rPr>
               <w:t>09:35</w:t>
@@ -288,12 +330,16 @@
               <w:spacing w:after="20" w:line="240" w:lineRule="auto"/>
               <w:rPr>
                 <w:rFonts w:hint="eastAsia"/>
+                <w:b/>
+                <w:bCs/>
                 <w:lang w:val="nl-NL"/>
               </w:rPr>
             </w:pPr>
             <w:r>
               <w:rPr>
                 <w:rFonts w:ascii="Test Söhne Halbfett" w:eastAsia="Test Söhne Halbfett" w:hAnsi="Test Söhne Halbfett" w:cs="Test Söhne Halbfett"/>
+                <w:b/>
+                <w:bCs/>
                 <w:color w:val="2C3C64"/>
                 <w:sz w:val="12"/>
                 <w:lang w:val="nl-NL"/>
@@ -306,12 +352,16 @@
               <w:spacing w:after="0" w:line="240" w:lineRule="auto"/>
               <w:rPr>
                 <w:rFonts w:hint="eastAsia"/>
+                <w:b/>
+                <w:bCs/>
                 <w:lang w:val="nl-NL"/>
               </w:rPr>
             </w:pPr>
             <w:r>
               <w:rPr>
                 <w:rFonts w:ascii="Test Söhne Halbfett" w:eastAsia="Test Söhne Halbfett" w:hAnsi="Test Söhne Halbfett" w:cs="Test Söhne Halbfett"/>
+                <w:b/>
+                <w:bCs/>
                 <w:lang w:val="nl-NL"/>
               </w:rPr>
               <w:t>Christelijke Hogeschool Ede</w:t>
@@ -319,6 +369,8 @@
             <w:r>
               <w:rPr>
                 <w:rFonts w:ascii="Test Söhne Halbfett" w:eastAsia="Test Söhne Halbfett" w:hAnsi="Test Söhne Halbfett" w:cs="Test Söhne Halbfett"/>
+                <w:b/>
+                <w:bCs/>
                 <w:lang w:val="nl-NL"/>
               </w:rPr>
               <w:br/>
@@ -333,6 +385,8 @@
         <w:spacing w:after="0" w:line="80" w:lineRule="exact"/>
         <w:rPr>
           <w:rFonts w:hint="eastAsia"/>
+          <w:b/>
+          <w:bCs/>
           <w:lang w:val="nl-NL"/>
         </w:rPr>
       </w:pPr>
@@ -377,16 +431,22 @@
               <w:spacing w:after="0" w:line="240" w:lineRule="auto"/>
               <w:rPr>
                 <w:rFonts w:hint="eastAsia"/>
+                <w:b/>
+                <w:bCs/>
               </w:rPr>
             </w:pPr>
+            <w:proofErr w:type="spellStart"/>
             <w:r>
               <w:rPr>
                 <w:rFonts w:ascii="Test Söhne Halbfett" w:eastAsia="Test Söhne Halbfett" w:hAnsi="Test Söhne Halbfett" w:cs="Test Söhne Halbfett"/>
+                <w:b/>
+                <w:bCs/>
                 <w:color w:val="FFFFFF"/>
                 <w:sz w:val="18"/>
               </w:rPr>
               <w:t>Beginsituatie</w:t>
             </w:r>
+            <w:proofErr w:type="spellEnd"/>
           </w:p>
         </w:tc>
         <w:tc>
@@ -405,11 +465,15 @@
               <w:spacing w:after="0" w:line="240" w:lineRule="auto"/>
               <w:rPr>
                 <w:rFonts w:hint="eastAsia"/>
+                <w:b/>
+                <w:bCs/>
               </w:rPr>
             </w:pPr>
             <w:r>
               <w:rPr>
                 <w:rFonts w:ascii="Test Söhne Halbfett" w:eastAsia="Test Söhne Halbfett" w:hAnsi="Test Söhne Halbfett" w:cs="Test Söhne Halbfett"/>
+                <w:b/>
+                <w:bCs/>
                 <w:color w:val="FFFFFF"/>
                 <w:sz w:val="18"/>
               </w:rPr>
@@ -440,12 +504,16 @@
               <w:spacing w:after="0" w:line="278" w:lineRule="auto"/>
               <w:rPr>
                 <w:rFonts w:hint="eastAsia"/>
+                <w:b/>
+                <w:bCs/>
                 <w:lang w:val="nl-NL"/>
               </w:rPr>
             </w:pPr>
             <w:r>
               <w:rPr>
                 <w:rFonts w:eastAsia="Test Söhne" w:cs="Test Söhne"/>
+                <w:b/>
+                <w:bCs/>
                 <w:lang w:val="nl-NL"/>
               </w:rPr>
               <w:t>Samen met mijn medestudenten van de deeltijdopleiding Theologie starten we de dag vaak met een dagopening. Iedere week opent iemand anders de dag. Dit keer was het mijn beurt om iets voor te bereiden. Omdat we de dag iedere week samen openen, vond ik het mooi om het belang te benadrukken van een gemeenschap van mede-gelovigen om je heen.</w:t>
@@ -467,6 +535,8 @@
             <w:pPr>
               <w:rPr>
                 <w:rFonts w:hint="eastAsia"/>
+                <w:b/>
+                <w:bCs/>
                 <w:lang w:val="nl-NL"/>
               </w:rPr>
             </w:pPr>
@@ -477,12 +547,16 @@
               <w:ind w:left="144" w:hanging="115"/>
               <w:rPr>
                 <w:rFonts w:hint="eastAsia"/>
+                <w:b/>
+                <w:bCs/>
                 <w:lang w:val="nl-NL"/>
               </w:rPr>
             </w:pPr>
             <w:r>
               <w:rPr>
                 <w:rFonts w:eastAsia="Test Söhne" w:cs="Test Söhne"/>
+                <w:b/>
+                <w:bCs/>
                 <w:sz w:val="15"/>
                 <w:lang w:val="nl-NL"/>
               </w:rPr>
@@ -495,12 +569,16 @@
               <w:ind w:left="144" w:hanging="115"/>
               <w:rPr>
                 <w:rFonts w:hint="eastAsia"/>
+                <w:b/>
+                <w:bCs/>
                 <w:lang w:val="nl-NL"/>
               </w:rPr>
             </w:pPr>
             <w:r>
               <w:rPr>
                 <w:rFonts w:eastAsia="Test Söhne" w:cs="Test Söhne"/>
+                <w:b/>
+                <w:bCs/>
                 <w:sz w:val="15"/>
                 <w:lang w:val="nl-NL"/>
               </w:rPr>
@@ -523,6 +601,8 @@
             <w:pPr>
               <w:rPr>
                 <w:rFonts w:hint="eastAsia"/>
+                <w:b/>
+                <w:bCs/>
                 <w:lang w:val="nl-NL"/>
               </w:rPr>
             </w:pPr>
@@ -544,12 +624,16 @@
               <w:spacing w:after="0" w:line="240" w:lineRule="auto"/>
               <w:rPr>
                 <w:rFonts w:hint="eastAsia"/>
+                <w:b/>
+                <w:bCs/>
                 <w:lang w:val="nl-NL"/>
               </w:rPr>
             </w:pPr>
             <w:r>
               <w:rPr>
                 <w:rFonts w:ascii="Test Söhne Halbfett" w:eastAsia="Test Söhne Halbfett" w:hAnsi="Test Söhne Halbfett" w:cs="Test Söhne Halbfett"/>
+                <w:b/>
+                <w:bCs/>
                 <w:color w:val="FFFFFF"/>
                 <w:sz w:val="18"/>
                 <w:lang w:val="nl-NL"/>
@@ -573,6 +657,8 @@
             <w:pPr>
               <w:rPr>
                 <w:rFonts w:hint="eastAsia"/>
+                <w:b/>
+                <w:bCs/>
                 <w:lang w:val="nl-NL"/>
               </w:rPr>
             </w:pPr>
@@ -594,12 +680,16 @@
               <w:spacing w:after="30" w:line="240" w:lineRule="auto"/>
               <w:rPr>
                 <w:rFonts w:hint="eastAsia"/>
+                <w:b/>
+                <w:bCs/>
                 <w:lang w:val="nl-NL"/>
               </w:rPr>
             </w:pPr>
             <w:r>
               <w:rPr>
                 <w:rFonts w:ascii="Test Söhne Halbfett" w:eastAsia="Test Söhne Halbfett" w:hAnsi="Test Söhne Halbfett" w:cs="Test Söhne Halbfett"/>
+                <w:b/>
+                <w:bCs/>
                 <w:color w:val="2C3C64"/>
                 <w:sz w:val="15"/>
                 <w:lang w:val="nl-NL"/>
@@ -612,24 +702,20 @@
               <w:spacing w:after="0" w:line="259" w:lineRule="auto"/>
               <w:rPr>
                 <w:rFonts w:hint="eastAsia"/>
+                <w:b/>
+                <w:bCs/>
                 <w:lang w:val="nl-NL"/>
               </w:rPr>
             </w:pPr>
             <w:r>
               <w:rPr>
                 <w:rFonts w:eastAsia="Test Söhne" w:cs="Test Söhne"/>
+                <w:b/>
+                <w:bCs/>
                 <w:sz w:val="14"/>
                 <w:lang w:val="nl-NL"/>
               </w:rPr>
-              <w:t xml:space="preserve">Aangezien de tekst kort en niet moeilijk te begrijpen is, kies ik voor de HSV. </w:t>
-            </w:r>
-            <w:r>
-              <w:rPr>
-                <w:rFonts w:eastAsia="Test Söhne" w:cs="Test Söhne"/>
-                <w:sz w:val="14"/>
-                <w:lang w:val="nl-NL"/>
-              </w:rPr>
-              <w:t>Deze vertaling blijft tekstueel dicht bij de grondtekst, zonder dat in dit gedeelte een hoog register wordt gebruikt.</w:t>
+              <w:t>Aangezien de tekst kort en niet moeilijk te begrijpen is, kies ik voor de HSV. Deze vertaling blijft tekstueel dicht bij de grondtekst, zonder dat in dit gedeelte een hoog register wordt gebruikt.</w:t>
             </w:r>
           </w:p>
         </w:tc>
@@ -640,6 +726,8 @@
         <w:spacing w:after="0" w:line="80" w:lineRule="exact"/>
         <w:rPr>
           <w:rFonts w:hint="eastAsia"/>
+          <w:b/>
+          <w:bCs/>
           <w:lang w:val="nl-NL"/>
         </w:rPr>
       </w:pPr>
@@ -692,11 +780,15 @@
               <w:spacing w:after="0" w:line="240" w:lineRule="auto"/>
               <w:rPr>
                 <w:rFonts w:hint="eastAsia"/>
+                <w:b/>
+                <w:bCs/>
               </w:rPr>
             </w:pPr>
             <w:r>
               <w:rPr>
                 <w:rFonts w:ascii="Test Söhne Halbfett" w:eastAsia="Test Söhne Halbfett" w:hAnsi="Test Söhne Halbfett" w:cs="Test Söhne Halbfett"/>
+                <w:b/>
+                <w:bCs/>
                 <w:color w:val="FFFFFF"/>
               </w:rPr>
               <w:t>LESVERLOOP</w:t>
@@ -721,11 +813,15 @@
               <w:jc w:val="right"/>
               <w:rPr>
                 <w:rFonts w:hint="eastAsia"/>
+                <w:b/>
+                <w:bCs/>
               </w:rPr>
             </w:pPr>
             <w:r>
               <w:rPr>
                 <w:rFonts w:ascii="Test Söhne Halbfett" w:eastAsia="Test Söhne Halbfett" w:hAnsi="Test Söhne Halbfett" w:cs="Test Söhne Halbfett"/>
+                <w:b/>
+                <w:bCs/>
                 <w:color w:val="2C3C64"/>
                 <w:sz w:val="14"/>
               </w:rPr>
@@ -734,6 +830,8 @@
             <w:r>
               <w:rPr>
                 <w:rFonts w:ascii="Test Söhne Halbfett" w:eastAsia="Test Söhne Halbfett" w:hAnsi="Test Söhne Halbfett" w:cs="Test Söhne Halbfett"/>
+                <w:b/>
+                <w:bCs/>
                 <w:color w:val="2C3C64"/>
                 <w:sz w:val="14"/>
               </w:rPr>
@@ -742,6 +840,8 @@
             <w:r>
               <w:rPr>
                 <w:rFonts w:ascii="Test Söhne Halbfett" w:eastAsia="Test Söhne Halbfett" w:hAnsi="Test Söhne Halbfett" w:cs="Test Söhne Halbfett"/>
+                <w:b/>
+                <w:bCs/>
                 <w:color w:val="2C3C64"/>
                 <w:sz w:val="14"/>
               </w:rPr>
@@ -784,11 +884,15 @@
               <w:spacing w:after="0" w:line="240" w:lineRule="auto"/>
               <w:rPr>
                 <w:rFonts w:hint="eastAsia"/>
+                <w:b/>
+                <w:bCs/>
               </w:rPr>
             </w:pPr>
             <w:r>
               <w:rPr>
                 <w:rFonts w:ascii="Test Söhne Halbfett" w:eastAsia="Test Söhne Halbfett" w:hAnsi="Test Söhne Halbfett" w:cs="Test Söhne Halbfett"/>
+                <w:b/>
+                <w:bCs/>
                 <w:color w:val="FFFFFF"/>
                 <w:sz w:val="12"/>
               </w:rPr>
@@ -813,11 +917,15 @@
               <w:spacing w:after="0" w:line="240" w:lineRule="auto"/>
               <w:rPr>
                 <w:rFonts w:hint="eastAsia"/>
+                <w:b/>
+                <w:bCs/>
               </w:rPr>
             </w:pPr>
             <w:r>
               <w:rPr>
                 <w:rFonts w:ascii="Test Söhne Halbfett" w:eastAsia="Test Söhne Halbfett" w:hAnsi="Test Söhne Halbfett" w:cs="Test Söhne Halbfett"/>
+                <w:b/>
+                <w:bCs/>
                 <w:color w:val="FFFFFF"/>
                 <w:sz w:val="12"/>
               </w:rPr>
@@ -826,6 +934,8 @@
             <w:r>
               <w:rPr>
                 <w:rFonts w:ascii="Test Söhne Halbfett" w:eastAsia="Test Söhne Halbfett" w:hAnsi="Test Söhne Halbfett" w:cs="Test Söhne Halbfett"/>
+                <w:b/>
+                <w:bCs/>
                 <w:color w:val="FFFFFF"/>
                 <w:sz w:val="12"/>
               </w:rPr>
@@ -851,11 +961,15 @@
               <w:spacing w:after="0" w:line="240" w:lineRule="auto"/>
               <w:rPr>
                 <w:rFonts w:hint="eastAsia"/>
+                <w:b/>
+                <w:bCs/>
               </w:rPr>
             </w:pPr>
             <w:r>
               <w:rPr>
                 <w:rFonts w:ascii="Test Söhne Halbfett" w:eastAsia="Test Söhne Halbfett" w:hAnsi="Test Söhne Halbfett" w:cs="Test Söhne Halbfett"/>
+                <w:b/>
+                <w:bCs/>
                 <w:color w:val="FFFFFF"/>
                 <w:sz w:val="12"/>
               </w:rPr>
@@ -864,6 +978,8 @@
             <w:r>
               <w:rPr>
                 <w:rFonts w:ascii="Test Söhne Halbfett" w:eastAsia="Test Söhne Halbfett" w:hAnsi="Test Söhne Halbfett" w:cs="Test Söhne Halbfett"/>
+                <w:b/>
+                <w:bCs/>
                 <w:color w:val="FFFFFF"/>
                 <w:sz w:val="12"/>
               </w:rPr>
@@ -889,11 +1005,15 @@
               <w:spacing w:after="0" w:line="240" w:lineRule="auto"/>
               <w:rPr>
                 <w:rFonts w:hint="eastAsia"/>
+                <w:b/>
+                <w:bCs/>
               </w:rPr>
             </w:pPr>
             <w:r>
               <w:rPr>
                 <w:rFonts w:ascii="Test Söhne Halbfett" w:eastAsia="Test Söhne Halbfett" w:hAnsi="Test Söhne Halbfett" w:cs="Test Söhne Halbfett"/>
+                <w:b/>
+                <w:bCs/>
                 <w:color w:val="FFFFFF"/>
                 <w:sz w:val="12"/>
               </w:rPr>
@@ -902,6 +1022,8 @@
             <w:r>
               <w:rPr>
                 <w:rFonts w:ascii="Test Söhne Halbfett" w:eastAsia="Test Söhne Halbfett" w:hAnsi="Test Söhne Halbfett" w:cs="Test Söhne Halbfett"/>
+                <w:b/>
+                <w:bCs/>
                 <w:color w:val="FFFFFF"/>
                 <w:sz w:val="12"/>
               </w:rPr>
@@ -927,11 +1049,15 @@
               <w:spacing w:after="0" w:line="240" w:lineRule="auto"/>
               <w:rPr>
                 <w:rFonts w:hint="eastAsia"/>
+                <w:b/>
+                <w:bCs/>
               </w:rPr>
             </w:pPr>
             <w:r>
               <w:rPr>
                 <w:rFonts w:ascii="Test Söhne Halbfett" w:eastAsia="Test Söhne Halbfett" w:hAnsi="Test Söhne Halbfett" w:cs="Test Söhne Halbfett"/>
+                <w:b/>
+                <w:bCs/>
                 <w:color w:val="FFFFFF"/>
                 <w:sz w:val="12"/>
               </w:rPr>
@@ -940,6 +1066,8 @@
             <w:r>
               <w:rPr>
                 <w:rFonts w:ascii="Test Söhne Halbfett" w:eastAsia="Test Söhne Halbfett" w:hAnsi="Test Söhne Halbfett" w:cs="Test Söhne Halbfett"/>
+                <w:b/>
+                <w:bCs/>
                 <w:color w:val="FFFFFF"/>
                 <w:sz w:val="12"/>
               </w:rPr>
@@ -982,11 +1110,15 @@
               <w:jc w:val="center"/>
               <w:rPr>
                 <w:rFonts w:hint="eastAsia"/>
+                <w:b/>
+                <w:bCs/>
               </w:rPr>
             </w:pPr>
             <w:r>
               <w:rPr>
                 <w:rFonts w:ascii="Test Söhne Halbfett" w:eastAsia="Test Söhne Halbfett" w:hAnsi="Test Söhne Halbfett" w:cs="Test Söhne Halbfett"/>
+                <w:b/>
+                <w:bCs/>
                 <w:color w:val="2C3C64"/>
                 <w:sz w:val="14"/>
               </w:rPr>
@@ -1009,6 +1141,8 @@
             <w:pPr>
               <w:rPr>
                 <w:rFonts w:hint="eastAsia"/>
+                <w:b/>
+                <w:bCs/>
                 <w:lang w:val="nl-NL"/>
               </w:rPr>
             </w:pPr>
@@ -1019,12 +1153,16 @@
               <w:ind w:left="130" w:hanging="115"/>
               <w:rPr>
                 <w:rFonts w:hint="eastAsia"/>
+                <w:b/>
+                <w:bCs/>
                 <w:lang w:val="nl-NL"/>
               </w:rPr>
             </w:pPr>
             <w:r>
               <w:rPr>
                 <w:rFonts w:eastAsia="Test Söhne" w:cs="Test Söhne"/>
+                <w:b/>
+                <w:bCs/>
                 <w:sz w:val="14"/>
                 <w:lang w:val="nl-NL"/>
               </w:rPr>
@@ -1037,12 +1175,16 @@
               <w:ind w:left="130" w:hanging="115"/>
               <w:rPr>
                 <w:rFonts w:hint="eastAsia"/>
+                <w:b/>
+                <w:bCs/>
                 <w:lang w:val="nl-NL"/>
               </w:rPr>
             </w:pPr>
             <w:r>
               <w:rPr>
                 <w:rFonts w:eastAsia="Test Söhne" w:cs="Test Söhne"/>
+                <w:b/>
+                <w:bCs/>
                 <w:sz w:val="14"/>
                 <w:lang w:val="nl-NL"/>
               </w:rPr>
@@ -1065,6 +1207,8 @@
             <w:pPr>
               <w:rPr>
                 <w:rFonts w:hint="eastAsia"/>
+                <w:b/>
+                <w:bCs/>
                 <w:lang w:val="nl-NL"/>
               </w:rPr>
             </w:pPr>
@@ -1075,15 +1219,30 @@
               <w:ind w:left="130" w:hanging="115"/>
               <w:rPr>
                 <w:rFonts w:hint="eastAsia"/>
+                <w:b/>
+                <w:bCs/>
               </w:rPr>
             </w:pPr>
             <w:r>
               <w:rPr>
                 <w:rFonts w:eastAsia="Test Söhne" w:cs="Test Söhne"/>
+                <w:b/>
+                <w:bCs/>
                 <w:sz w:val="14"/>
               </w:rPr>
-              <w:t>• Luisteren</w:t>
+              <w:t xml:space="preserve">• </w:t>
             </w:r>
+            <w:proofErr w:type="spellStart"/>
+            <w:r>
+              <w:rPr>
+                <w:rFonts w:eastAsia="Test Söhne" w:cs="Test Söhne"/>
+                <w:b/>
+                <w:bCs/>
+                <w:sz w:val="14"/>
+              </w:rPr>
+              <w:t>Luisteren</w:t>
+            </w:r>
+            <w:proofErr w:type="spellEnd"/>
           </w:p>
           <w:p>
             <w:pPr>
@@ -1091,11 +1250,15 @@
               <w:ind w:left="130" w:hanging="115"/>
               <w:rPr>
                 <w:rFonts w:hint="eastAsia"/>
+                <w:b/>
+                <w:bCs/>
               </w:rPr>
             </w:pPr>
             <w:r>
               <w:rPr>
                 <w:rFonts w:eastAsia="Test Söhne" w:cs="Test Söhne"/>
+                <w:b/>
+                <w:bCs/>
                 <w:sz w:val="14"/>
               </w:rPr>
               <w:t>• Schriftgedeelte opzoeken</w:t>
@@ -1117,6 +1280,8 @@
             <w:pPr>
               <w:rPr>
                 <w:rFonts w:hint="eastAsia"/>
+                <w:b/>
+                <w:bCs/>
                 <w:lang w:val="nl-NL"/>
               </w:rPr>
             </w:pPr>
@@ -1127,12 +1292,16 @@
               <w:ind w:left="130" w:hanging="115"/>
               <w:rPr>
                 <w:rFonts w:hint="eastAsia"/>
+                <w:b/>
+                <w:bCs/>
                 <w:lang w:val="nl-NL"/>
               </w:rPr>
             </w:pPr>
             <w:r>
               <w:rPr>
                 <w:rFonts w:eastAsia="Test Söhne" w:cs="Test Söhne"/>
+                <w:b/>
+                <w:bCs/>
                 <w:sz w:val="14"/>
                 <w:lang w:val="nl-NL"/>
               </w:rPr>
@@ -1145,12 +1314,16 @@
               <w:ind w:left="130" w:hanging="115"/>
               <w:rPr>
                 <w:rFonts w:hint="eastAsia"/>
+                <w:b/>
+                <w:bCs/>
                 <w:lang w:val="nl-NL"/>
               </w:rPr>
             </w:pPr>
             <w:r>
               <w:rPr>
                 <w:rFonts w:eastAsia="Test Söhne" w:cs="Test Söhne"/>
+                <w:b/>
+                <w:bCs/>
                 <w:sz w:val="14"/>
                 <w:lang w:val="nl-NL"/>
               </w:rPr>
@@ -1162,12 +1335,16 @@
               <w:spacing w:before="30" w:after="10" w:line="240" w:lineRule="auto"/>
               <w:rPr>
                 <w:rFonts w:hint="eastAsia"/>
+                <w:b/>
+                <w:bCs/>
                 <w:lang w:val="nl-NL"/>
               </w:rPr>
             </w:pPr>
             <w:r>
               <w:rPr>
                 <w:rFonts w:ascii="Test Söhne Halbfett" w:eastAsia="Test Söhne Halbfett" w:hAnsi="Test Söhne Halbfett" w:cs="Test Söhne Halbfett"/>
+                <w:b/>
+                <w:bCs/>
                 <w:color w:val="2C3C64"/>
                 <w:sz w:val="12"/>
                 <w:lang w:val="nl-NL"/>
@@ -1181,12 +1358,16 @@
               <w:ind w:left="187"/>
               <w:rPr>
                 <w:rFonts w:hint="eastAsia"/>
+                <w:b/>
+                <w:bCs/>
                 <w:lang w:val="nl-NL"/>
               </w:rPr>
             </w:pPr>
             <w:r>
               <w:rPr>
                 <w:rFonts w:eastAsia="Test Söhne" w:cs="Test Söhne"/>
+                <w:b/>
+                <w:bCs/>
                 <w:color w:val="5F6E8C"/>
                 <w:sz w:val="13"/>
                 <w:lang w:val="nl-NL"/>
@@ -1200,16 +1381,32 @@
               <w:ind w:left="187"/>
               <w:rPr>
                 <w:rFonts w:hint="eastAsia"/>
+                <w:b/>
+                <w:bCs/>
               </w:rPr>
             </w:pPr>
             <w:r>
               <w:rPr>
                 <w:rFonts w:eastAsia="Test Söhne" w:cs="Test Söhne"/>
+                <w:b/>
+                <w:bCs/>
                 <w:color w:val="5F6E8C"/>
                 <w:sz w:val="13"/>
               </w:rPr>
-              <w:t>- Presentator</w:t>
+              <w:t xml:space="preserve">- </w:t>
             </w:r>
+            <w:proofErr w:type="spellStart"/>
+            <w:r>
+              <w:rPr>
+                <w:rFonts w:eastAsia="Test Söhne" w:cs="Test Söhne"/>
+                <w:b/>
+                <w:bCs/>
+                <w:color w:val="5F6E8C"/>
+                <w:sz w:val="13"/>
+              </w:rPr>
+              <w:t>Presentator</w:t>
+            </w:r>
+            <w:proofErr w:type="spellEnd"/>
           </w:p>
         </w:tc>
         <w:tc>
@@ -1227,6 +1424,8 @@
             <w:pPr>
               <w:rPr>
                 <w:rFonts w:hint="eastAsia"/>
+                <w:b/>
+                <w:bCs/>
                 <w:lang w:val="nl-NL"/>
               </w:rPr>
             </w:pPr>
@@ -1237,12 +1436,16 @@
               <w:ind w:left="130" w:hanging="115"/>
               <w:rPr>
                 <w:rFonts w:hint="eastAsia"/>
+                <w:b/>
+                <w:bCs/>
                 <w:lang w:val="nl-NL"/>
               </w:rPr>
             </w:pPr>
             <w:r>
               <w:rPr>
                 <w:rFonts w:eastAsia="Test Söhne" w:cs="Test Söhne"/>
+                <w:b/>
+                <w:bCs/>
                 <w:sz w:val="14"/>
                 <w:lang w:val="nl-NL"/>
               </w:rPr>
@@ -1255,12 +1458,16 @@
               <w:ind w:left="130" w:hanging="115"/>
               <w:rPr>
                 <w:rFonts w:hint="eastAsia"/>
+                <w:b/>
+                <w:bCs/>
                 <w:lang w:val="nl-NL"/>
               </w:rPr>
             </w:pPr>
             <w:r>
               <w:rPr>
                 <w:rFonts w:eastAsia="Test Söhne" w:cs="Test Söhne"/>
+                <w:b/>
+                <w:bCs/>
                 <w:sz w:val="14"/>
                 <w:lang w:val="nl-NL"/>
               </w:rPr>
@@ -1302,11 +1509,15 @@
               <w:jc w:val="center"/>
               <w:rPr>
                 <w:rFonts w:hint="eastAsia"/>
+                <w:b/>
+                <w:bCs/>
               </w:rPr>
             </w:pPr>
             <w:r>
               <w:rPr>
                 <w:rFonts w:ascii="Test Söhne Halbfett" w:eastAsia="Test Söhne Halbfett" w:hAnsi="Test Söhne Halbfett" w:cs="Test Söhne Halbfett"/>
+                <w:b/>
+                <w:bCs/>
                 <w:color w:val="2C3C64"/>
                 <w:sz w:val="14"/>
               </w:rPr>
@@ -1315,6 +1526,8 @@
             <w:r>
               <w:rPr>
                 <w:rFonts w:ascii="Test Söhne Halbfett" w:eastAsia="Test Söhne Halbfett" w:hAnsi="Test Söhne Halbfett" w:cs="Test Söhne Halbfett"/>
+                <w:b/>
+                <w:bCs/>
                 <w:color w:val="2C3C64"/>
                 <w:sz w:val="14"/>
               </w:rPr>
@@ -1323,6 +1536,8 @@
             <w:r>
               <w:rPr>
                 <w:rFonts w:ascii="Test Söhne Halbfett" w:eastAsia="Test Söhne Halbfett" w:hAnsi="Test Söhne Halbfett" w:cs="Test Söhne Halbfett"/>
+                <w:b/>
+                <w:bCs/>
                 <w:color w:val="2C3C64"/>
                 <w:sz w:val="14"/>
               </w:rPr>
@@ -1345,6 +1560,8 @@
             <w:pPr>
               <w:rPr>
                 <w:rFonts w:hint="eastAsia"/>
+                <w:b/>
+                <w:bCs/>
               </w:rPr>
             </w:pPr>
           </w:p>
@@ -1354,11 +1571,15 @@
               <w:ind w:left="130" w:hanging="115"/>
               <w:rPr>
                 <w:rFonts w:hint="eastAsia"/>
+                <w:b/>
+                <w:bCs/>
               </w:rPr>
             </w:pPr>
             <w:r>
               <w:rPr>
                 <w:rFonts w:eastAsia="Test Söhne" w:cs="Test Söhne"/>
+                <w:b/>
+                <w:bCs/>
                 <w:sz w:val="14"/>
               </w:rPr>
               <w:t>• Schriftlezing</w:t>
@@ -1380,6 +1601,8 @@
             <w:pPr>
               <w:rPr>
                 <w:rFonts w:hint="eastAsia"/>
+                <w:b/>
+                <w:bCs/>
               </w:rPr>
             </w:pPr>
           </w:p>
@@ -1389,11 +1612,15 @@
               <w:ind w:left="130" w:hanging="115"/>
               <w:rPr>
                 <w:rFonts w:hint="eastAsia"/>
+                <w:b/>
+                <w:bCs/>
               </w:rPr>
             </w:pPr>
             <w:r>
               <w:rPr>
                 <w:rFonts w:eastAsia="Test Söhne" w:cs="Test Söhne"/>
+                <w:b/>
+                <w:bCs/>
                 <w:sz w:val="14"/>
               </w:rPr>
               <w:t>• Luisteren</w:t>
@@ -1405,11 +1632,15 @@
               <w:ind w:left="130" w:hanging="115"/>
               <w:rPr>
                 <w:rFonts w:hint="eastAsia"/>
+                <w:b/>
+                <w:bCs/>
               </w:rPr>
             </w:pPr>
             <w:r>
               <w:rPr>
                 <w:rFonts w:eastAsia="Test Söhne" w:cs="Test Söhne"/>
+                <w:b/>
+                <w:bCs/>
                 <w:sz w:val="14"/>
               </w:rPr>
               <w:t>• Meelezen</w:t>
@@ -1431,6 +1662,8 @@
             <w:pPr>
               <w:rPr>
                 <w:rFonts w:hint="eastAsia"/>
+                <w:b/>
+                <w:bCs/>
               </w:rPr>
             </w:pPr>
           </w:p>
@@ -1440,11 +1673,15 @@
               <w:ind w:left="130" w:hanging="115"/>
               <w:rPr>
                 <w:rFonts w:hint="eastAsia"/>
+                <w:b/>
+                <w:bCs/>
               </w:rPr>
             </w:pPr>
             <w:r>
               <w:rPr>
                 <w:rFonts w:eastAsia="Test Söhne" w:cs="Test Söhne"/>
+                <w:b/>
+                <w:bCs/>
                 <w:sz w:val="14"/>
               </w:rPr>
               <w:t>• Voorlezen</w:t>
@@ -1456,11 +1693,15 @@
               <w:ind w:left="130" w:hanging="115"/>
               <w:rPr>
                 <w:rFonts w:hint="eastAsia"/>
+                <w:b/>
+                <w:bCs/>
               </w:rPr>
             </w:pPr>
             <w:r>
               <w:rPr>
                 <w:rFonts w:eastAsia="Test Söhne" w:cs="Test Söhne"/>
+                <w:b/>
+                <w:bCs/>
                 <w:sz w:val="14"/>
               </w:rPr>
               <w:t>• Vertellen</w:t>
@@ -1471,11 +1712,15 @@
               <w:spacing w:before="30" w:after="10" w:line="240" w:lineRule="auto"/>
               <w:rPr>
                 <w:rFonts w:hint="eastAsia"/>
+                <w:b/>
+                <w:bCs/>
               </w:rPr>
             </w:pPr>
             <w:r>
               <w:rPr>
                 <w:rFonts w:ascii="Test Söhne Halbfett" w:eastAsia="Test Söhne Halbfett" w:hAnsi="Test Söhne Halbfett" w:cs="Test Söhne Halbfett"/>
+                <w:b/>
+                <w:bCs/>
                 <w:color w:val="2C3C64"/>
                 <w:sz w:val="12"/>
               </w:rPr>
@@ -1488,11 +1733,15 @@
               <w:ind w:left="187"/>
               <w:rPr>
                 <w:rFonts w:hint="eastAsia"/>
+                <w:b/>
+                <w:bCs/>
               </w:rPr>
             </w:pPr>
             <w:r>
               <w:rPr>
                 <w:rFonts w:eastAsia="Test Söhne" w:cs="Test Söhne"/>
+                <w:b/>
+                <w:bCs/>
                 <w:color w:val="5F6E8C"/>
                 <w:sz w:val="13"/>
               </w:rPr>
@@ -1515,6 +1764,8 @@
             <w:pPr>
               <w:rPr>
                 <w:rFonts w:hint="eastAsia"/>
+                <w:b/>
+                <w:bCs/>
                 <w:lang w:val="nl-NL"/>
               </w:rPr>
             </w:pPr>
@@ -1525,16 +1776,42 @@
               <w:ind w:left="130" w:hanging="115"/>
               <w:rPr>
                 <w:rFonts w:hint="eastAsia"/>
+                <w:b/>
+                <w:bCs/>
                 <w:lang w:val="nl-NL"/>
               </w:rPr>
             </w:pPr>
             <w:r>
               <w:rPr>
                 <w:rFonts w:eastAsia="Test Söhne" w:cs="Test Söhne"/>
+                <w:b/>
+                <w:bCs/>
                 <w:sz w:val="14"/>
                 <w:lang w:val="nl-NL"/>
               </w:rPr>
-              <w:t>• Wachten tot iedereen het bijbelboek heeft geopend.</w:t>
+              <w:t xml:space="preserve">• Wachten tot iedereen het </w:t>
+            </w:r>
+            <w:proofErr w:type="spellStart"/>
+            <w:r>
+              <w:rPr>
+                <w:rFonts w:eastAsia="Test Söhne" w:cs="Test Söhne"/>
+                <w:b/>
+                <w:bCs/>
+                <w:sz w:val="14"/>
+                <w:lang w:val="nl-NL"/>
+              </w:rPr>
+              <w:t>bijbelboek</w:t>
+            </w:r>
+            <w:proofErr w:type="spellEnd"/>
+            <w:r>
+              <w:rPr>
+                <w:rFonts w:eastAsia="Test Söhne" w:cs="Test Söhne"/>
+                <w:b/>
+                <w:bCs/>
+                <w:sz w:val="14"/>
+                <w:lang w:val="nl-NL"/>
+              </w:rPr>
+              <w:t xml:space="preserve"> heeft geopend.</w:t>
             </w:r>
           </w:p>
         </w:tc>
@@ -1572,11 +1849,15 @@
               <w:jc w:val="center"/>
               <w:rPr>
                 <w:rFonts w:hint="eastAsia"/>
+                <w:b/>
+                <w:bCs/>
               </w:rPr>
             </w:pPr>
             <w:r>
               <w:rPr>
                 <w:rFonts w:ascii="Test Söhne Halbfett" w:eastAsia="Test Söhne Halbfett" w:hAnsi="Test Söhne Halbfett" w:cs="Test Söhne Halbfett"/>
+                <w:b/>
+                <w:bCs/>
                 <w:color w:val="2C3C64"/>
                 <w:sz w:val="14"/>
               </w:rPr>
@@ -1585,6 +1866,8 @@
             <w:r>
               <w:rPr>
                 <w:rFonts w:ascii="Test Söhne Halbfett" w:eastAsia="Test Söhne Halbfett" w:hAnsi="Test Söhne Halbfett" w:cs="Test Söhne Halbfett"/>
+                <w:b/>
+                <w:bCs/>
                 <w:color w:val="2C3C64"/>
                 <w:sz w:val="14"/>
               </w:rPr>
@@ -1607,6 +1890,8 @@
             <w:pPr>
               <w:rPr>
                 <w:rFonts w:hint="eastAsia"/>
+                <w:b/>
+                <w:bCs/>
               </w:rPr>
             </w:pPr>
           </w:p>
@@ -1616,11 +1901,15 @@
               <w:ind w:left="130" w:hanging="115"/>
               <w:rPr>
                 <w:rFonts w:hint="eastAsia"/>
+                <w:b/>
+                <w:bCs/>
               </w:rPr>
             </w:pPr>
             <w:r>
               <w:rPr>
                 <w:rFonts w:eastAsia="Test Söhne" w:cs="Test Söhne"/>
+                <w:b/>
+                <w:bCs/>
                 <w:sz w:val="14"/>
               </w:rPr>
               <w:t>• Luisteren naar de docent</w:t>
@@ -1642,6 +1931,8 @@
             <w:pPr>
               <w:rPr>
                 <w:rFonts w:hint="eastAsia"/>
+                <w:b/>
+                <w:bCs/>
               </w:rPr>
             </w:pPr>
           </w:p>
@@ -1651,11 +1942,15 @@
               <w:ind w:left="130" w:hanging="115"/>
               <w:rPr>
                 <w:rFonts w:hint="eastAsia"/>
+                <w:b/>
+                <w:bCs/>
               </w:rPr>
             </w:pPr>
             <w:r>
               <w:rPr>
                 <w:rFonts w:eastAsia="Test Söhne" w:cs="Test Söhne"/>
+                <w:b/>
+                <w:bCs/>
                 <w:sz w:val="14"/>
               </w:rPr>
               <w:t>• Luisteren</w:t>
@@ -1677,6 +1972,8 @@
             <w:pPr>
               <w:rPr>
                 <w:rFonts w:hint="eastAsia"/>
+                <w:b/>
+                <w:bCs/>
                 <w:lang w:val="nl-NL"/>
               </w:rPr>
             </w:pPr>
@@ -1687,12 +1984,16 @@
               <w:ind w:left="130" w:hanging="115"/>
               <w:rPr>
                 <w:rFonts w:hint="eastAsia"/>
+                <w:b/>
+                <w:bCs/>
                 <w:lang w:val="nl-NL"/>
               </w:rPr>
             </w:pPr>
             <w:r>
               <w:rPr>
                 <w:rFonts w:eastAsia="Test Söhne" w:cs="Test Söhne"/>
+                <w:b/>
+                <w:bCs/>
                 <w:sz w:val="14"/>
                 <w:lang w:val="nl-NL"/>
               </w:rPr>
@@ -1715,6 +2016,8 @@
             <w:pPr>
               <w:rPr>
                 <w:rFonts w:hint="eastAsia"/>
+                <w:b/>
+                <w:bCs/>
                 <w:lang w:val="nl-NL"/>
               </w:rPr>
             </w:pPr>
@@ -1754,11 +2057,15 @@
               <w:jc w:val="center"/>
               <w:rPr>
                 <w:rFonts w:hint="eastAsia"/>
+                <w:b/>
+                <w:bCs/>
               </w:rPr>
             </w:pPr>
             <w:r>
               <w:rPr>
                 <w:rFonts w:ascii="Test Söhne Halbfett" w:eastAsia="Test Söhne Halbfett" w:hAnsi="Test Söhne Halbfett" w:cs="Test Söhne Halbfett"/>
+                <w:b/>
+                <w:bCs/>
                 <w:color w:val="2C3C64"/>
                 <w:sz w:val="14"/>
               </w:rPr>
@@ -1781,6 +2088,8 @@
             <w:pPr>
               <w:rPr>
                 <w:rFonts w:hint="eastAsia"/>
+                <w:b/>
+                <w:bCs/>
               </w:rPr>
             </w:pPr>
           </w:p>
@@ -1790,11 +2099,15 @@
               <w:ind w:left="130" w:hanging="115"/>
               <w:rPr>
                 <w:rFonts w:hint="eastAsia"/>
+                <w:b/>
+                <w:bCs/>
               </w:rPr>
             </w:pPr>
             <w:r>
               <w:rPr>
                 <w:rFonts w:eastAsia="Test Söhne" w:cs="Test Söhne"/>
+                <w:b/>
+                <w:bCs/>
                 <w:sz w:val="14"/>
               </w:rPr>
               <w:t>• Rondvraag</w:t>
@@ -1816,6 +2129,8 @@
             <w:pPr>
               <w:rPr>
                 <w:rFonts w:hint="eastAsia"/>
+                <w:b/>
+                <w:bCs/>
               </w:rPr>
             </w:pPr>
           </w:p>
@@ -1825,11 +2140,15 @@
               <w:ind w:left="130" w:hanging="115"/>
               <w:rPr>
                 <w:rFonts w:hint="eastAsia"/>
+                <w:b/>
+                <w:bCs/>
               </w:rPr>
             </w:pPr>
             <w:r>
               <w:rPr>
                 <w:rFonts w:eastAsia="Test Söhne" w:cs="Test Söhne"/>
+                <w:b/>
+                <w:bCs/>
                 <w:sz w:val="14"/>
               </w:rPr>
               <w:t>• Interactie</w:t>
@@ -1841,11 +2160,15 @@
               <w:ind w:left="130" w:hanging="115"/>
               <w:rPr>
                 <w:rFonts w:hint="eastAsia"/>
+                <w:b/>
+                <w:bCs/>
               </w:rPr>
             </w:pPr>
             <w:r>
               <w:rPr>
                 <w:rFonts w:eastAsia="Test Söhne" w:cs="Test Söhne"/>
+                <w:b/>
+                <w:bCs/>
                 <w:sz w:val="14"/>
               </w:rPr>
               <w:t>• Vragen beantwoorden</w:t>
@@ -1867,6 +2190,8 @@
             <w:pPr>
               <w:rPr>
                 <w:rFonts w:hint="eastAsia"/>
+                <w:b/>
+                <w:bCs/>
                 <w:lang w:val="nl-NL"/>
               </w:rPr>
             </w:pPr>
@@ -1877,12 +2202,16 @@
               <w:ind w:left="115" w:hanging="115"/>
               <w:rPr>
                 <w:rFonts w:hint="eastAsia"/>
+                <w:b/>
+                <w:bCs/>
                 <w:lang w:val="nl-NL"/>
               </w:rPr>
             </w:pPr>
             <w:r>
               <w:rPr>
                 <w:rFonts w:eastAsia="Test Söhne" w:cs="Test Söhne"/>
+                <w:b/>
+                <w:bCs/>
                 <w:sz w:val="13"/>
                 <w:lang w:val="nl-NL"/>
               </w:rPr>
@@ -1894,12 +2223,16 @@
               <w:spacing w:before="14" w:after="2" w:line="240" w:lineRule="auto"/>
               <w:rPr>
                 <w:rFonts w:hint="eastAsia"/>
+                <w:b/>
+                <w:bCs/>
                 <w:lang w:val="nl-NL"/>
               </w:rPr>
             </w:pPr>
             <w:r>
               <w:rPr>
                 <w:rFonts w:ascii="Test Söhne Halbfett" w:eastAsia="Test Söhne Halbfett" w:hAnsi="Test Söhne Halbfett" w:cs="Test Söhne Halbfett"/>
+                <w:b/>
+                <w:bCs/>
                 <w:color w:val="2C3C64"/>
                 <w:sz w:val="11"/>
                 <w:lang w:val="nl-NL"/>
@@ -1913,12 +2246,16 @@
               <w:ind w:left="173"/>
               <w:rPr>
                 <w:rFonts w:hint="eastAsia"/>
+                <w:b/>
+                <w:bCs/>
                 <w:lang w:val="nl-NL"/>
               </w:rPr>
             </w:pPr>
             <w:r>
               <w:rPr>
                 <w:rFonts w:eastAsia="Test Söhne" w:cs="Test Söhne"/>
+                <w:b/>
+                <w:bCs/>
                 <w:color w:val="5F6E8C"/>
                 <w:sz w:val="12"/>
                 <w:lang w:val="nl-NL"/>
@@ -1932,12 +2269,16 @@
               <w:ind w:left="173"/>
               <w:rPr>
                 <w:rFonts w:hint="eastAsia"/>
+                <w:b/>
+                <w:bCs/>
                 <w:lang w:val="nl-NL"/>
               </w:rPr>
             </w:pPr>
             <w:r>
               <w:rPr>
                 <w:rFonts w:eastAsia="Test Söhne" w:cs="Test Söhne"/>
+                <w:b/>
+                <w:bCs/>
                 <w:color w:val="5F6E8C"/>
                 <w:sz w:val="12"/>
                 <w:lang w:val="nl-NL"/>
@@ -1951,12 +2292,16 @@
               <w:ind w:left="115" w:hanging="115"/>
               <w:rPr>
                 <w:rFonts w:hint="eastAsia"/>
+                <w:b/>
+                <w:bCs/>
                 <w:lang w:val="nl-NL"/>
               </w:rPr>
             </w:pPr>
             <w:r>
               <w:rPr>
                 <w:rFonts w:eastAsia="Test Söhne" w:cs="Test Söhne"/>
+                <w:b/>
+                <w:bCs/>
                 <w:sz w:val="13"/>
                 <w:lang w:val="nl-NL"/>
               </w:rPr>
@@ -1969,12 +2314,16 @@
               <w:ind w:left="115" w:hanging="115"/>
               <w:rPr>
                 <w:rFonts w:hint="eastAsia"/>
+                <w:b/>
+                <w:bCs/>
                 <w:lang w:val="nl-NL"/>
               </w:rPr>
             </w:pPr>
             <w:r>
               <w:rPr>
                 <w:rFonts w:eastAsia="Test Söhne" w:cs="Test Söhne"/>
+                <w:b/>
+                <w:bCs/>
                 <w:sz w:val="13"/>
                 <w:lang w:val="nl-NL"/>
               </w:rPr>
@@ -1997,6 +2346,8 @@
             <w:pPr>
               <w:rPr>
                 <w:rFonts w:hint="eastAsia"/>
+                <w:b/>
+                <w:bCs/>
                 <w:lang w:val="nl-NL"/>
               </w:rPr>
             </w:pPr>
@@ -2007,6 +2358,8 @@
     <w:p>
       <w:pPr>
         <w:rPr>
+          <w:b/>
+          <w:bCs/>
           <w:lang w:val="nl-NL"/>
         </w:rPr>
       </w:pPr>
@@ -2065,13 +2418,23 @@
         <w:rFonts w:hint="eastAsia"/>
       </w:rPr>
     </w:pPr>
+    <w:proofErr w:type="gramStart"/>
     <w:r>
       <w:rPr>
         <w:rFonts w:ascii="Test Söhne Halbfett" w:eastAsia="Test Söhne Halbfett" w:hAnsi="Test Söhne Halbfett" w:cs="Test Söhne Halbfett"/>
         <w:color w:val="5F6E8C"/>
         <w:sz w:val="12"/>
       </w:rPr>
-      <w:t>DAGOPENING  ·  DEELTIJD THEOLOGIE</w:t>
+      <w:t>DAGOPENING  ·</w:t>
+    </w:r>
+    <w:proofErr w:type="gramEnd"/>
+    <w:r>
+      <w:rPr>
+        <w:rFonts w:ascii="Test Söhne Halbfett" w:eastAsia="Test Söhne Halbfett" w:hAnsi="Test Söhne Halbfett" w:cs="Test Söhne Halbfett"/>
+        <w:color w:val="5F6E8C"/>
+        <w:sz w:val="12"/>
+      </w:rPr>
+      <w:t xml:space="preserve">  DEELTIJD THEOLOGIE</w:t>
     </w:r>
   </w:p>
 </w:ftr>

</xml_diff>